<commit_message>
updates to data processing code to produce table & abrm (numerator only) datasets
</commit_message>
<xml_diff>
--- a/notes/26_rwjf_cd_countyMort_analytic_plan_0629.docx
+++ b/notes/26_rwjf_cd_countyMort_analytic_plan_0629.docx
@@ -1,6 +1,6 @@
 
 <file path=word/document.xml><?xml version="1.0" encoding="utf-8"?>
-<w:document xmlns:wpc="http://schemas.microsoft.com/office/word/2010/wordprocessingCanvas" xmlns:cx="http://schemas.microsoft.com/office/drawing/2014/chartex" xmlns:cx1="http://schemas.microsoft.com/office/drawing/2015/9/8/chartex" xmlns:cx2="http://schemas.microsoft.com/office/drawing/2015/10/21/chartex" xmlns:cx3="http://schemas.microsoft.com/office/drawing/2016/5/9/chartex" xmlns:cx4="http://schemas.microsoft.com/office/drawing/2016/5/10/chartex" xmlns:cx5="http://schemas.microsoft.com/office/drawing/2016/5/11/chartex" xmlns:cx6="http://schemas.microsoft.com/office/drawing/2016/5/12/chartex" xmlns:cx7="http://schemas.microsoft.com/office/drawing/2016/5/13/chartex" xmlns:cx8="http://schemas.microsoft.com/office/drawing/2016/5/14/chartex" xmlns:mc="http://schemas.openxmlformats.org/markup-compatibility/2006" xmlns:aink="http://schemas.microsoft.com/office/drawing/2016/ink" xmlns:am3d="http://schemas.microsoft.com/office/drawing/2017/model3d" xmlns:o="urn:schemas-microsoft-com:office:office" xmlns:oel="http://schemas.microsoft.com/office/2019/extlst" xmlns:r="http://schemas.openxmlformats.org/officeDocument/2006/relationships" xmlns:m="http://schemas.openxmlformats.org/officeDocument/2006/math" xmlns:v="urn:schemas-microsoft-com:vml" xmlns:wp14="http://schemas.microsoft.com/office/word/2010/wordprocessingDrawing" xmlns:wp="http://schemas.openxmlformats.org/drawingml/2006/wordprocessingDrawing" xmlns:w10="urn:schemas-microsoft-com:office:word" xmlns:w="http://schemas.openxmlformats.org/wordprocessingml/2006/main" xmlns:w14="http://schemas.microsoft.com/office/word/2010/wordml" xmlns:w15="http://schemas.microsoft.com/office/word/2012/wordml" xmlns:w16cex="http://schemas.microsoft.com/office/word/2018/wordml/cex" xmlns:w16cid="http://schemas.microsoft.com/office/word/2016/wordml/cid" xmlns:w16="http://schemas.microsoft.com/office/word/2018/wordml" xmlns:w16du="http://schemas.microsoft.com/office/word/2023/wordml/word16du" xmlns:w16sdtdh="http://schemas.microsoft.com/office/word/2020/wordml/sdtdatahash" xmlns:w16sdtfl="http://schemas.microsoft.com/office/word/2024/wordml/sdtformatlock" xmlns:w16se="http://schemas.microsoft.com/office/word/2015/wordml/symex" xmlns:wpg="http://schemas.microsoft.com/office/word/2010/wordprocessingGroup" xmlns:wpi="http://schemas.microsoft.com/office/word/2010/wordprocessingInk" xmlns:wne="http://schemas.microsoft.com/office/word/2006/wordml" xmlns:wps="http://schemas.microsoft.com/office/word/2010/wordprocessingShape" mc:Ignorable="w14 w15 w16se w16cid w16 w16cex w16sdtdh w16sdtfl w16du wp14">
+<w:document xmlns:wpc="http://schemas.microsoft.com/office/word/2010/wordprocessingCanvas" xmlns:cx="http://schemas.microsoft.com/office/drawing/2014/chartex" xmlns:cx1="http://schemas.microsoft.com/office/drawing/2015/9/8/chartex" xmlns:cx2="http://schemas.microsoft.com/office/drawing/2015/10/21/chartex" xmlns:cx3="http://schemas.microsoft.com/office/drawing/2016/5/9/chartex" xmlns:cx4="http://schemas.microsoft.com/office/drawing/2016/5/10/chartex" xmlns:cx5="http://schemas.microsoft.com/office/drawing/2016/5/11/chartex" xmlns:cx6="http://schemas.microsoft.com/office/drawing/2016/5/12/chartex" xmlns:cx7="http://schemas.microsoft.com/office/drawing/2016/5/13/chartex" xmlns:cx8="http://schemas.microsoft.com/office/drawing/2016/5/14/chartex" xmlns:mc="http://schemas.openxmlformats.org/markup-compatibility/2006" xmlns:aink="http://schemas.microsoft.com/office/drawing/2016/ink" xmlns:am3d="http://schemas.microsoft.com/office/drawing/2017/model3d" xmlns:o="urn:schemas-microsoft-com:office:office" xmlns:oel="http://schemas.microsoft.com/office/2019/extlst" xmlns:r="http://schemas.openxmlformats.org/officeDocument/2006/relationships" xmlns:m="http://schemas.openxmlformats.org/officeDocument/2006/math" xmlns:v="urn:schemas-microsoft-com:vml" xmlns:wp14="http://schemas.microsoft.com/office/word/2010/wordprocessingDrawing" xmlns:wp="http://schemas.openxmlformats.org/drawingml/2006/wordprocessingDrawing" xmlns:w10="urn:schemas-microsoft-com:office:word" xmlns:w="http://schemas.openxmlformats.org/wordprocessingml/2006/main" xmlns:w14="http://schemas.microsoft.com/office/word/2010/wordml" xmlns:w15="http://schemas.microsoft.com/office/word/2012/wordml" xmlns:w16cei="http://schemas.microsoft.com/office/word/2026/wordml/cei" xmlns:w16cex="http://schemas.microsoft.com/office/word/2018/wordml/cex" xmlns:w16cid="http://schemas.microsoft.com/office/word/2016/wordml/cid" xmlns:w16="http://schemas.microsoft.com/office/word/2018/wordml" xmlns:w16du="http://schemas.microsoft.com/office/word/2023/wordml/word16du" xmlns:w16sdtdh="http://schemas.microsoft.com/office/word/2020/wordml/sdtdatahash" xmlns:w16sdtfl="http://schemas.microsoft.com/office/word/2024/wordml/sdtformatlock" xmlns:w16se="http://schemas.microsoft.com/office/word/2015/wordml/symex" xmlns:wpg="http://schemas.microsoft.com/office/word/2010/wordprocessingGroup" xmlns:wpi="http://schemas.microsoft.com/office/word/2010/wordprocessingInk" xmlns:wne="http://schemas.microsoft.com/office/word/2006/wordml" xmlns:wps="http://schemas.microsoft.com/office/word/2010/wordprocessingShape" mc:Ignorable="w14 w15 w16se w16cid w16 w16cex w16sdtdh w16sdtfl w16du wp14">
   <w:body>
     <w:p>
       <w:pPr>
@@ -118,23 +118,7 @@
           <w:sz w:val="22"/>
           <w:szCs w:val="22"/>
         </w:rPr>
-        <w:t xml:space="preserve"> </w:t>
-      </w:r>
-      <w:r>
-        <w:rPr>
-          <w:rFonts w:ascii="Calibri" w:hAnsi="Calibri" w:cs="Calibri"/>
-          <w:sz w:val="22"/>
-          <w:szCs w:val="22"/>
-        </w:rPr>
-        <w:t xml:space="preserve">atom-based regression modeling </w:t>
-      </w:r>
-      <w:r>
-        <w:rPr>
-          <w:rFonts w:ascii="Calibri" w:hAnsi="Calibri" w:cs="Calibri"/>
-          <w:sz w:val="22"/>
-          <w:szCs w:val="22"/>
-        </w:rPr>
-        <w:t xml:space="preserve">using </w:t>
+        <w:t xml:space="preserve"> atom-based regression modeling using </w:t>
       </w:r>
       <w:r>
         <w:rPr>
@@ -1776,15 +1760,6 @@
     </w:tbl>
     <w:p>
       <w:pPr>
-        <w:rPr>
-          <w:rFonts w:ascii="Calibri" w:hAnsi="Calibri" w:cs="Calibri"/>
-          <w:sz w:val="22"/>
-          <w:szCs w:val="22"/>
-        </w:rPr>
-      </w:pPr>
-    </w:p>
-    <w:p>
-      <w:pPr>
         <w:pStyle w:val="Heading1"/>
         <w:rPr>
           <w:rFonts w:ascii="Calibri Light" w:hAnsi="Calibri Light" w:cs="Calibri Light"/>
@@ -1822,47 +1797,7 @@
           <w:sz w:val="22"/>
           <w:szCs w:val="22"/>
         </w:rPr>
-        <w:t>Congressional District (CD) Political Metrics</w:t>
-      </w:r>
-      <w:r>
-        <w:rPr>
-          <w:rFonts w:ascii="Calibri Light" w:hAnsi="Calibri Light" w:cs="Calibri Light"/>
-          <w:sz w:val="22"/>
-          <w:szCs w:val="22"/>
-        </w:rPr>
-        <w:t xml:space="preserve"> : </w:t>
-      </w:r>
-      <w:r>
-        <w:rPr>
-          <w:rFonts w:ascii="Calibri Light" w:hAnsi="Calibri Light" w:cs="Calibri Light"/>
-          <w:sz w:val="22"/>
-          <w:szCs w:val="22"/>
-        </w:rPr>
-        <w:t>(X-grid</w:t>
-      </w:r>
-      <w:r>
-        <w:rPr>
-          <w:rFonts w:ascii="Calibri Light" w:hAnsi="Calibri Light" w:cs="Calibri Light"/>
-          <w:sz w:val="22"/>
-          <w:szCs w:val="22"/>
-        </w:rPr>
-        <w:t>/“Exposures”</w:t>
-      </w:r>
-      <w:r>
-        <w:rPr>
-          <w:rFonts w:ascii="Calibri Light" w:hAnsi="Calibri Light" w:cs="Calibri Light"/>
-          <w:sz w:val="22"/>
-          <w:szCs w:val="22"/>
-        </w:rPr>
-        <w:t>)</w:t>
-      </w:r>
-      <w:r>
-        <w:rPr>
-          <w:rFonts w:ascii="Calibri Light" w:hAnsi="Calibri Light" w:cs="Calibri Light"/>
-          <w:sz w:val="22"/>
-          <w:szCs w:val="22"/>
-        </w:rPr>
-        <w:t xml:space="preserve"> </w:t>
+        <w:t xml:space="preserve">Congressional District (CD) Political Metrics : (X-grid/“Exposures”) </w:t>
       </w:r>
     </w:p>
     <w:p>
@@ -1893,16 +1828,7 @@
           <w:szCs w:val="22"/>
           <w:vertAlign w:val="superscript"/>
         </w:rPr>
-        <w:t xml:space="preserve"> </w:t>
-      </w:r>
-      <w:r>
-        <w:rPr>
-          <w:rFonts w:ascii="Calibri" w:hAnsi="Calibri" w:cs="Calibri"/>
-          <w:sz w:val="22"/>
-          <w:szCs w:val="22"/>
-          <w:vertAlign w:val="superscript"/>
-        </w:rPr>
-        <w:t>1</w:t>
+        <w:t xml:space="preserve"> 1</w:t>
       </w:r>
       <w:r>
         <w:rPr>
@@ -1971,15 +1897,7 @@
           <w:sz w:val="22"/>
           <w:szCs w:val="22"/>
         </w:rPr>
-        <w:t>T</w:t>
-      </w:r>
-      <w:r>
-        <w:rPr>
-          <w:rFonts w:ascii="Calibri" w:hAnsi="Calibri" w:cs="Calibri"/>
-          <w:sz w:val="22"/>
-          <w:szCs w:val="22"/>
-        </w:rPr>
-        <w:t>his value will be the same for every state</w:t>
+        <w:t>This value will be the same for every state</w:t>
       </w:r>
     </w:p>
     <w:p>
@@ -2003,15 +1921,7 @@
           <w:sz w:val="22"/>
           <w:szCs w:val="22"/>
         </w:rPr>
-        <w:t>State Policy Index</w:t>
-      </w:r>
-      <w:r>
-        <w:rPr>
-          <w:rFonts w:ascii="Calibri" w:hAnsi="Calibri" w:cs="Calibri"/>
-          <w:sz w:val="22"/>
-          <w:szCs w:val="22"/>
-        </w:rPr>
-        <w:t xml:space="preserve"> </w:t>
+        <w:t xml:space="preserve">State Policy Index </w:t>
       </w:r>
       <w:r>
         <w:rPr>
@@ -2318,18 +2228,7 @@
                 <w:sz w:val="22"/>
                 <w:szCs w:val="22"/>
               </w:rPr>
-              <w:t>Numerator</w:t>
-            </w:r>
-            <w:r>
-              <w:rPr>
-                <w:rFonts w:ascii="Calibri" w:eastAsia="Times New Roman" w:hAnsi="Calibri" w:cs="Calibri"/>
-                <w:b/>
-                <w:bCs/>
-                <w:color w:val="000000"/>
-                <w:sz w:val="22"/>
-                <w:szCs w:val="22"/>
-              </w:rPr>
-              <w:t xml:space="preserve"> Source</w:t>
+              <w:t>Numerator Source</w:t>
             </w:r>
           </w:p>
         </w:tc>
@@ -2500,29 +2399,7 @@
                 <w:sz w:val="22"/>
                 <w:szCs w:val="22"/>
               </w:rPr>
-              <w:t>Denominator</w:t>
-            </w:r>
-            <w:r>
-              <w:rPr>
-                <w:rFonts w:ascii="Calibri" w:eastAsia="Times New Roman" w:hAnsi="Calibri" w:cs="Calibri"/>
-                <w:b/>
-                <w:bCs/>
-                <w:color w:val="000000"/>
-                <w:sz w:val="22"/>
-                <w:szCs w:val="22"/>
-              </w:rPr>
-              <w:t xml:space="preserve"> </w:t>
-            </w:r>
-            <w:r>
-              <w:rPr>
-                <w:rFonts w:ascii="Calibri" w:eastAsia="Times New Roman" w:hAnsi="Calibri" w:cs="Calibri"/>
-                <w:b/>
-                <w:bCs/>
-                <w:color w:val="000000"/>
-                <w:sz w:val="22"/>
-                <w:szCs w:val="22"/>
-              </w:rPr>
-              <w:t>Geography</w:t>
+              <w:t>Denominator Geography</w:t>
             </w:r>
             <w:commentRangeEnd w:id="0"/>
             <w:r>
@@ -2967,16 +2844,25 @@
                 <w:sz w:val="22"/>
                 <w:szCs w:val="22"/>
               </w:rPr>
-              <w:t>Block group/</w:t>
-            </w:r>
-            <w:r>
-              <w:rPr>
-                <w:rFonts w:ascii="Calibri" w:eastAsia="Times New Roman" w:hAnsi="Calibri" w:cs="Calibri"/>
-                <w:color w:val="000000"/>
-                <w:sz w:val="22"/>
-                <w:szCs w:val="22"/>
-              </w:rPr>
-              <w:t>Atom</w:t>
+              <w:t>Block group</w:t>
+            </w:r>
+            <w:r>
+              <w:rPr>
+                <w:rFonts w:ascii="Calibri" w:eastAsia="Times New Roman" w:hAnsi="Calibri" w:cs="Calibri"/>
+                <w:color w:val="000000"/>
+                <w:sz w:val="22"/>
+                <w:szCs w:val="22"/>
+              </w:rPr>
+              <w:t xml:space="preserve"> aggregated to a</w:t>
+            </w:r>
+            <w:r>
+              <w:rPr>
+                <w:rFonts w:ascii="Calibri" w:eastAsia="Times New Roman" w:hAnsi="Calibri" w:cs="Calibri"/>
+                <w:color w:val="000000"/>
+                <w:sz w:val="22"/>
+                <w:szCs w:val="22"/>
+              </w:rPr>
+              <w:t>tom</w:t>
             </w:r>
           </w:p>
         </w:tc>
@@ -3157,25 +3043,7 @@
                 <w:sz w:val="22"/>
                 <w:szCs w:val="22"/>
               </w:rPr>
-              <w:t xml:space="preserve">umber of </w:t>
-            </w:r>
-            <w:r>
-              <w:rPr>
-                <w:rFonts w:ascii="Calibri" w:eastAsia="Times New Roman" w:hAnsi="Calibri" w:cs="Calibri"/>
-                <w:color w:val="000000"/>
-                <w:sz w:val="22"/>
-                <w:szCs w:val="22"/>
-              </w:rPr>
-              <w:t>people</w:t>
-            </w:r>
-            <w:r>
-              <w:rPr>
-                <w:rFonts w:ascii="Calibri" w:eastAsia="Times New Roman" w:hAnsi="Calibri" w:cs="Calibri"/>
-                <w:color w:val="000000"/>
-                <w:sz w:val="22"/>
-                <w:szCs w:val="22"/>
-              </w:rPr>
-              <w:t xml:space="preserve"> </w:t>
+              <w:t xml:space="preserve">umber of people </w:t>
             </w:r>
             <w:r>
               <w:rPr>
@@ -3246,7 +3114,16 @@
                 <w:sz w:val="22"/>
                 <w:szCs w:val="22"/>
               </w:rPr>
-              <w:t>Block group/Atom</w:t>
+              <w:t xml:space="preserve">Block group aggregated to </w:t>
+            </w:r>
+            <w:r>
+              <w:rPr>
+                <w:rFonts w:ascii="Calibri" w:eastAsia="Times New Roman" w:hAnsi="Calibri" w:cs="Calibri"/>
+                <w:color w:val="000000"/>
+                <w:sz w:val="22"/>
+                <w:szCs w:val="22"/>
+              </w:rPr>
+              <w:t>atom</w:t>
             </w:r>
           </w:p>
         </w:tc>
@@ -3497,16 +3374,7 @@
                 <w:sz w:val="22"/>
                 <w:szCs w:val="22"/>
               </w:rPr>
-              <w:t xml:space="preserve">Number of deaths </w:t>
-            </w:r>
-            <w:r>
-              <w:rPr>
-                <w:rFonts w:ascii="Calibri" w:eastAsia="Times New Roman" w:hAnsi="Calibri" w:cs="Calibri"/>
-                <w:color w:val="000000"/>
-                <w:sz w:val="22"/>
-                <w:szCs w:val="22"/>
-              </w:rPr>
-              <w:t>from influenza or pneumonia</w:t>
+              <w:t>Number of deaths from influenza or pneumonia</w:t>
             </w:r>
           </w:p>
         </w:tc>
@@ -3661,7 +3529,7 @@
                 <w:sz w:val="22"/>
                 <w:szCs w:val="22"/>
               </w:rPr>
-              <w:t>Block group/Atom</w:t>
+              <w:t>Block group aggregated to atom</w:t>
             </w:r>
           </w:p>
         </w:tc>
@@ -3741,16 +3609,7 @@
                 <w:sz w:val="22"/>
                 <w:szCs w:val="22"/>
               </w:rPr>
-              <w:t xml:space="preserve"> </w:t>
-            </w:r>
-            <w:r>
-              <w:rPr>
-                <w:rFonts w:ascii="Calibri" w:eastAsia="Times New Roman" w:hAnsi="Calibri" w:cs="Calibri"/>
-                <w:color w:val="000000"/>
-                <w:sz w:val="22"/>
-                <w:szCs w:val="22"/>
-              </w:rPr>
-              <w:t>Cancer (all sites)</w:t>
+              <w:t xml:space="preserve"> Cancer (all sites)</w:t>
             </w:r>
           </w:p>
         </w:tc>
@@ -3906,7 +3765,7 @@
                 <w:sz w:val="22"/>
                 <w:szCs w:val="22"/>
               </w:rPr>
-              <w:t>Block group/Atom</w:t>
+              <w:t>Block group aggregated to atom</w:t>
             </w:r>
           </w:p>
         </w:tc>
@@ -3977,25 +3836,7 @@
                 <w:sz w:val="22"/>
                 <w:szCs w:val="22"/>
               </w:rPr>
-              <w:t>N</w:t>
-            </w:r>
-            <w:r>
-              <w:rPr>
-                <w:rFonts w:ascii="Calibri" w:eastAsia="Times New Roman" w:hAnsi="Calibri" w:cs="Calibri"/>
-                <w:color w:val="000000"/>
-                <w:sz w:val="22"/>
-                <w:szCs w:val="22"/>
-              </w:rPr>
-              <w:t>umber of deaths from</w:t>
-            </w:r>
-            <w:r>
-              <w:rPr>
-                <w:rFonts w:ascii="Calibri" w:eastAsia="Times New Roman" w:hAnsi="Calibri" w:cs="Calibri"/>
-                <w:color w:val="000000"/>
-                <w:sz w:val="22"/>
-                <w:szCs w:val="22"/>
-              </w:rPr>
-              <w:t xml:space="preserve"> breast cancer</w:t>
+              <w:t>Number of deaths from breast cancer</w:t>
             </w:r>
           </w:p>
         </w:tc>
@@ -4089,16 +3930,7 @@
                 <w:sz w:val="22"/>
                 <w:szCs w:val="22"/>
               </w:rPr>
-              <w:t>Female</w:t>
-            </w:r>
-            <w:r>
-              <w:rPr>
-                <w:rFonts w:ascii="Calibri" w:eastAsia="Times New Roman" w:hAnsi="Calibri" w:cs="Calibri"/>
-                <w:color w:val="000000"/>
-                <w:sz w:val="22"/>
-                <w:szCs w:val="22"/>
-              </w:rPr>
-              <w:t xml:space="preserve"> population</w:t>
+              <w:t>Female population</w:t>
             </w:r>
           </w:p>
         </w:tc>
@@ -4160,7 +3992,7 @@
                 <w:sz w:val="22"/>
                 <w:szCs w:val="22"/>
               </w:rPr>
-              <w:t>Block group/Atom</w:t>
+              <w:t>Block group aggregated to atom</w:t>
             </w:r>
           </w:p>
         </w:tc>
@@ -4302,16 +4134,7 @@
                 <w:sz w:val="22"/>
                 <w:szCs w:val="22"/>
               </w:rPr>
-              <w:t>County</w:t>
-            </w:r>
-            <w:r>
-              <w:rPr>
-                <w:rFonts w:ascii="Calibri" w:eastAsia="Times New Roman" w:hAnsi="Calibri" w:cs="Calibri"/>
-                <w:color w:val="000000"/>
-                <w:sz w:val="22"/>
-                <w:szCs w:val="22"/>
-              </w:rPr>
-              <w:t xml:space="preserve"> </w:t>
+              <w:t xml:space="preserve">County </w:t>
             </w:r>
           </w:p>
         </w:tc>
@@ -4405,7 +4228,7 @@
                 <w:sz w:val="22"/>
                 <w:szCs w:val="22"/>
               </w:rPr>
-              <w:t>Block group/Atom</w:t>
+              <w:t>Block group aggregated to atom</w:t>
             </w:r>
           </w:p>
         </w:tc>
@@ -4641,7 +4464,7 @@
                 <w:sz w:val="22"/>
                 <w:szCs w:val="22"/>
               </w:rPr>
-              <w:t>Block group/Atom</w:t>
+              <w:t>Block group aggregated to atom</w:t>
             </w:r>
           </w:p>
         </w:tc>
@@ -4722,16 +4545,7 @@
                 <w:sz w:val="22"/>
                 <w:szCs w:val="22"/>
               </w:rPr>
-              <w:t xml:space="preserve"> </w:t>
-            </w:r>
-            <w:r>
-              <w:rPr>
-                <w:rFonts w:ascii="Calibri" w:eastAsia="Times New Roman" w:hAnsi="Calibri" w:cs="Calibri"/>
-                <w:color w:val="000000"/>
-                <w:sz w:val="22"/>
-                <w:szCs w:val="22"/>
-              </w:rPr>
-              <w:t>cardiovascular disease</w:t>
+              <w:t xml:space="preserve"> cardiovascular disease</w:t>
             </w:r>
           </w:p>
         </w:tc>
@@ -4887,7 +4701,7 @@
                 <w:sz w:val="22"/>
                 <w:szCs w:val="22"/>
               </w:rPr>
-              <w:t>Block group/Atom</w:t>
+              <w:t>Block group aggregated to atom</w:t>
             </w:r>
           </w:p>
         </w:tc>
@@ -6316,15 +6130,7 @@
           <w:sz w:val="22"/>
           <w:szCs w:val="22"/>
         </w:rPr>
-        <w:t>Covariates (exist in both X &amp; Y-grid):</w:t>
-      </w:r>
-      <w:r>
-        <w:rPr>
-          <w:rFonts w:ascii="Calibri Light" w:hAnsi="Calibri Light" w:cs="Calibri Light"/>
-          <w:sz w:val="22"/>
-          <w:szCs w:val="22"/>
-        </w:rPr>
-        <w:t xml:space="preserve"> </w:t>
+        <w:t xml:space="preserve">Covariates (exist in both X &amp; Y-grid): </w:t>
       </w:r>
       <w:commentRangeEnd w:id="1"/>
       <w:r>
@@ -6857,23 +6663,7 @@
           <w:sz w:val="22"/>
           <w:szCs w:val="22"/>
         </w:rPr>
-        <w:t xml:space="preserve">U.S. Census Bureau. "Sex by Age (American Indian and Alaska Native Alone)." American Community Survey, ACS </w:t>
-      </w:r>
-      <w:r>
-        <w:rPr>
-          <w:rFonts w:ascii="Calibri" w:hAnsi="Calibri" w:cs="Calibri"/>
-          <w:sz w:val="22"/>
-          <w:szCs w:val="22"/>
-        </w:rPr>
-        <w:t>5</w:t>
-      </w:r>
-      <w:r>
-        <w:rPr>
-          <w:rFonts w:ascii="Calibri" w:hAnsi="Calibri" w:cs="Calibri"/>
-          <w:sz w:val="22"/>
-          <w:szCs w:val="22"/>
-        </w:rPr>
-        <w:t>-Year Estimates Detailed Tables, Table B01001C.</w:t>
+        <w:t>U.S. Census Bureau. "Sex by Age (American Indian and Alaska Native Alone)." American Community Survey, ACS 5-Year Estimates Detailed Tables, Table B01001C.</w:t>
       </w:r>
     </w:p>
     <w:p>
@@ -6909,31 +6699,7 @@
           <w:sz w:val="22"/>
           <w:szCs w:val="22"/>
         </w:rPr>
-        <w:t xml:space="preserve">U.S. Census Bureau. "Ratio of Income to Poverty Level in the Past 12 Months by Nativity of Children Under 18 Years in Families and Subfamilies by Living Arrangements and Nativity of Parents." American Community Survey, ACS </w:t>
-      </w:r>
-      <w:r>
-        <w:rPr>
-          <w:rFonts w:ascii="Calibri" w:hAnsi="Calibri" w:cs="Calibri"/>
-          <w:sz w:val="22"/>
-          <w:szCs w:val="22"/>
-        </w:rPr>
-        <w:t>5</w:t>
-      </w:r>
-      <w:r>
-        <w:rPr>
-          <w:rFonts w:ascii="Calibri" w:hAnsi="Calibri" w:cs="Calibri"/>
-          <w:sz w:val="22"/>
-          <w:szCs w:val="22"/>
-        </w:rPr>
-        <w:t>-Year Estimates Detailed Tables, Table B05010</w:t>
-      </w:r>
-      <w:r>
-        <w:rPr>
-          <w:rFonts w:ascii="Calibri" w:hAnsi="Calibri" w:cs="Calibri"/>
-          <w:sz w:val="22"/>
-          <w:szCs w:val="22"/>
-        </w:rPr>
-        <w:t>.</w:t>
+        <w:t>U.S. Census Bureau. "Ratio of Income to Poverty Level in the Past 12 Months by Nativity of Children Under 18 Years in Families and Subfamilies by Living Arrangements and Nativity of Parents." American Community Survey, ACS 5-Year Estimates Detailed Tables, Table B05010.</w:t>
       </w:r>
     </w:p>
     <w:p>
@@ -7137,7 +6903,7 @@
 </file>
 
 <file path=word/comments.xml><?xml version="1.0" encoding="utf-8"?>
-<w:comments xmlns:wpc="http://schemas.microsoft.com/office/word/2010/wordprocessingCanvas" xmlns:cx="http://schemas.microsoft.com/office/drawing/2014/chartex" xmlns:cx1="http://schemas.microsoft.com/office/drawing/2015/9/8/chartex" xmlns:cx2="http://schemas.microsoft.com/office/drawing/2015/10/21/chartex" xmlns:cx3="http://schemas.microsoft.com/office/drawing/2016/5/9/chartex" xmlns:cx4="http://schemas.microsoft.com/office/drawing/2016/5/10/chartex" xmlns:cx5="http://schemas.microsoft.com/office/drawing/2016/5/11/chartex" xmlns:cx6="http://schemas.microsoft.com/office/drawing/2016/5/12/chartex" xmlns:cx7="http://schemas.microsoft.com/office/drawing/2016/5/13/chartex" xmlns:cx8="http://schemas.microsoft.com/office/drawing/2016/5/14/chartex" xmlns:mc="http://schemas.openxmlformats.org/markup-compatibility/2006" xmlns:aink="http://schemas.microsoft.com/office/drawing/2016/ink" xmlns:am3d="http://schemas.microsoft.com/office/drawing/2017/model3d" xmlns:o="urn:schemas-microsoft-com:office:office" xmlns:oel="http://schemas.microsoft.com/office/2019/extlst" xmlns:r="http://schemas.openxmlformats.org/officeDocument/2006/relationships" xmlns:m="http://schemas.openxmlformats.org/officeDocument/2006/math" xmlns:v="urn:schemas-microsoft-com:vml" xmlns:wp14="http://schemas.microsoft.com/office/word/2010/wordprocessingDrawing" xmlns:wp="http://schemas.openxmlformats.org/drawingml/2006/wordprocessingDrawing" xmlns:w10="urn:schemas-microsoft-com:office:word" xmlns:w="http://schemas.openxmlformats.org/wordprocessingml/2006/main" xmlns:w14="http://schemas.microsoft.com/office/word/2010/wordml" xmlns:w15="http://schemas.microsoft.com/office/word/2012/wordml" xmlns:w16cex="http://schemas.microsoft.com/office/word/2018/wordml/cex" xmlns:w16cid="http://schemas.microsoft.com/office/word/2016/wordml/cid" xmlns:w16="http://schemas.microsoft.com/office/word/2018/wordml" xmlns:w16du="http://schemas.microsoft.com/office/word/2023/wordml/word16du" xmlns:w16sdtdh="http://schemas.microsoft.com/office/word/2020/wordml/sdtdatahash" xmlns:w16sdtfl="http://schemas.microsoft.com/office/word/2024/wordml/sdtformatlock" xmlns:w16se="http://schemas.microsoft.com/office/word/2015/wordml/symex" xmlns:wpg="http://schemas.microsoft.com/office/word/2010/wordprocessingGroup" xmlns:wpi="http://schemas.microsoft.com/office/word/2010/wordprocessingInk" xmlns:wne="http://schemas.microsoft.com/office/word/2006/wordml" xmlns:wps="http://schemas.microsoft.com/office/word/2010/wordprocessingShape" mc:Ignorable="w14 w15 w16se w16cid w16 w16cex w16sdtdh w16sdtfl w16du wp14">
+<w:comments xmlns:wpc="http://schemas.microsoft.com/office/word/2010/wordprocessingCanvas" xmlns:cx="http://schemas.microsoft.com/office/drawing/2014/chartex" xmlns:cx1="http://schemas.microsoft.com/office/drawing/2015/9/8/chartex" xmlns:cx2="http://schemas.microsoft.com/office/drawing/2015/10/21/chartex" xmlns:cx3="http://schemas.microsoft.com/office/drawing/2016/5/9/chartex" xmlns:cx4="http://schemas.microsoft.com/office/drawing/2016/5/10/chartex" xmlns:cx5="http://schemas.microsoft.com/office/drawing/2016/5/11/chartex" xmlns:cx6="http://schemas.microsoft.com/office/drawing/2016/5/12/chartex" xmlns:cx7="http://schemas.microsoft.com/office/drawing/2016/5/13/chartex" xmlns:cx8="http://schemas.microsoft.com/office/drawing/2016/5/14/chartex" xmlns:mc="http://schemas.openxmlformats.org/markup-compatibility/2006" xmlns:aink="http://schemas.microsoft.com/office/drawing/2016/ink" xmlns:am3d="http://schemas.microsoft.com/office/drawing/2017/model3d" xmlns:o="urn:schemas-microsoft-com:office:office" xmlns:oel="http://schemas.microsoft.com/office/2019/extlst" xmlns:r="http://schemas.openxmlformats.org/officeDocument/2006/relationships" xmlns:m="http://schemas.openxmlformats.org/officeDocument/2006/math" xmlns:v="urn:schemas-microsoft-com:vml" xmlns:wp14="http://schemas.microsoft.com/office/word/2010/wordprocessingDrawing" xmlns:wp="http://schemas.openxmlformats.org/drawingml/2006/wordprocessingDrawing" xmlns:w10="urn:schemas-microsoft-com:office:word" xmlns:w="http://schemas.openxmlformats.org/wordprocessingml/2006/main" xmlns:w14="http://schemas.microsoft.com/office/word/2010/wordml" xmlns:w15="http://schemas.microsoft.com/office/word/2012/wordml" xmlns:w16cei="http://schemas.microsoft.com/office/word/2026/wordml/cei" xmlns:w16cex="http://schemas.microsoft.com/office/word/2018/wordml/cex" xmlns:w16cid="http://schemas.microsoft.com/office/word/2016/wordml/cid" xmlns:w16="http://schemas.microsoft.com/office/word/2018/wordml" xmlns:w16du="http://schemas.microsoft.com/office/word/2023/wordml/word16du" xmlns:w16sdtdh="http://schemas.microsoft.com/office/word/2020/wordml/sdtdatahash" xmlns:w16sdtfl="http://schemas.microsoft.com/office/word/2024/wordml/sdtformatlock" xmlns:w16se="http://schemas.microsoft.com/office/word/2015/wordml/symex" xmlns:wpg="http://schemas.microsoft.com/office/word/2010/wordprocessingGroup" xmlns:wpi="http://schemas.microsoft.com/office/word/2010/wordprocessingInk" xmlns:wne="http://schemas.microsoft.com/office/word/2006/wordml" xmlns:wps="http://schemas.microsoft.com/office/word/2010/wordprocessingShape" mc:Ignorable="w14 w15 w16se w16cid w16 w16cex w16sdtdh w16sdtfl w16du wp14">
   <w:comment w:id="0" w:author="Johnson, Nykesha R." w:date="2026-06-29T18:27:00Z" w:initials="NJ">
     <w:p>
       <w:pPr>
@@ -7213,28 +6979,28 @@
 </file>
 
 <file path=word/commentsExtended.xml><?xml version="1.0" encoding="utf-8"?>
-<w15:commentsEx xmlns:wpc="http://schemas.microsoft.com/office/word/2010/wordprocessingCanvas" xmlns:cx="http://schemas.microsoft.com/office/drawing/2014/chartex" xmlns:cx1="http://schemas.microsoft.com/office/drawing/2015/9/8/chartex" xmlns:cx2="http://schemas.microsoft.com/office/drawing/2015/10/21/chartex" xmlns:cx3="http://schemas.microsoft.com/office/drawing/2016/5/9/chartex" xmlns:cx4="http://schemas.microsoft.com/office/drawing/2016/5/10/chartex" xmlns:cx5="http://schemas.microsoft.com/office/drawing/2016/5/11/chartex" xmlns:cx6="http://schemas.microsoft.com/office/drawing/2016/5/12/chartex" xmlns:cx7="http://schemas.microsoft.com/office/drawing/2016/5/13/chartex" xmlns:cx8="http://schemas.microsoft.com/office/drawing/2016/5/14/chartex" xmlns:mc="http://schemas.openxmlformats.org/markup-compatibility/2006" xmlns:aink="http://schemas.microsoft.com/office/drawing/2016/ink" xmlns:am3d="http://schemas.microsoft.com/office/drawing/2017/model3d" xmlns:o="urn:schemas-microsoft-com:office:office" xmlns:oel="http://schemas.microsoft.com/office/2019/extlst" xmlns:r="http://schemas.openxmlformats.org/officeDocument/2006/relationships" xmlns:m="http://schemas.openxmlformats.org/officeDocument/2006/math" xmlns:v="urn:schemas-microsoft-com:vml" xmlns:wp14="http://schemas.microsoft.com/office/word/2010/wordprocessingDrawing" xmlns:wp="http://schemas.openxmlformats.org/drawingml/2006/wordprocessingDrawing" xmlns:w10="urn:schemas-microsoft-com:office:word" xmlns:w="http://schemas.openxmlformats.org/wordprocessingml/2006/main" xmlns:w14="http://schemas.microsoft.com/office/word/2010/wordml" xmlns:w15="http://schemas.microsoft.com/office/word/2012/wordml" xmlns:w16cex="http://schemas.microsoft.com/office/word/2018/wordml/cex" xmlns:w16cid="http://schemas.microsoft.com/office/word/2016/wordml/cid" xmlns:w16="http://schemas.microsoft.com/office/word/2018/wordml" xmlns:w16du="http://schemas.microsoft.com/office/word/2023/wordml/word16du" xmlns:w16sdtdh="http://schemas.microsoft.com/office/word/2020/wordml/sdtdatahash" xmlns:w16sdtfl="http://schemas.microsoft.com/office/word/2024/wordml/sdtformatlock" xmlns:w16se="http://schemas.microsoft.com/office/word/2015/wordml/symex" xmlns:wpg="http://schemas.microsoft.com/office/word/2010/wordprocessingGroup" xmlns:wpi="http://schemas.microsoft.com/office/word/2010/wordprocessingInk" xmlns:wne="http://schemas.microsoft.com/office/word/2006/wordml" xmlns:wps="http://schemas.microsoft.com/office/word/2010/wordprocessingShape" mc:Ignorable="w14 w15 w16se w16cid w16 w16cex w16sdtdh w16sdtfl w16du wp14">
+<w15:commentsEx xmlns:wpc="http://schemas.microsoft.com/office/word/2010/wordprocessingCanvas" xmlns:cx="http://schemas.microsoft.com/office/drawing/2014/chartex" xmlns:cx1="http://schemas.microsoft.com/office/drawing/2015/9/8/chartex" xmlns:cx2="http://schemas.microsoft.com/office/drawing/2015/10/21/chartex" xmlns:cx3="http://schemas.microsoft.com/office/drawing/2016/5/9/chartex" xmlns:cx4="http://schemas.microsoft.com/office/drawing/2016/5/10/chartex" xmlns:cx5="http://schemas.microsoft.com/office/drawing/2016/5/11/chartex" xmlns:cx6="http://schemas.microsoft.com/office/drawing/2016/5/12/chartex" xmlns:cx7="http://schemas.microsoft.com/office/drawing/2016/5/13/chartex" xmlns:cx8="http://schemas.microsoft.com/office/drawing/2016/5/14/chartex" xmlns:mc="http://schemas.openxmlformats.org/markup-compatibility/2006" xmlns:aink="http://schemas.microsoft.com/office/drawing/2016/ink" xmlns:am3d="http://schemas.microsoft.com/office/drawing/2017/model3d" xmlns:o="urn:schemas-microsoft-com:office:office" xmlns:oel="http://schemas.microsoft.com/office/2019/extlst" xmlns:r="http://schemas.openxmlformats.org/officeDocument/2006/relationships" xmlns:m="http://schemas.openxmlformats.org/officeDocument/2006/math" xmlns:v="urn:schemas-microsoft-com:vml" xmlns:wp14="http://schemas.microsoft.com/office/word/2010/wordprocessingDrawing" xmlns:wp="http://schemas.openxmlformats.org/drawingml/2006/wordprocessingDrawing" xmlns:w10="urn:schemas-microsoft-com:office:word" xmlns:w="http://schemas.openxmlformats.org/wordprocessingml/2006/main" xmlns:w14="http://schemas.microsoft.com/office/word/2010/wordml" xmlns:w15="http://schemas.microsoft.com/office/word/2012/wordml" xmlns:w16cei="http://schemas.microsoft.com/office/word/2026/wordml/cei" xmlns:w16cex="http://schemas.microsoft.com/office/word/2018/wordml/cex" xmlns:w16cid="http://schemas.microsoft.com/office/word/2016/wordml/cid" xmlns:w16="http://schemas.microsoft.com/office/word/2018/wordml" xmlns:w16du="http://schemas.microsoft.com/office/word/2023/wordml/word16du" xmlns:w16sdtdh="http://schemas.microsoft.com/office/word/2020/wordml/sdtdatahash" xmlns:w16sdtfl="http://schemas.microsoft.com/office/word/2024/wordml/sdtformatlock" xmlns:w16se="http://schemas.microsoft.com/office/word/2015/wordml/symex" xmlns:wpg="http://schemas.microsoft.com/office/word/2010/wordprocessingGroup" xmlns:wpi="http://schemas.microsoft.com/office/word/2010/wordprocessingInk" xmlns:wne="http://schemas.microsoft.com/office/word/2006/wordml" xmlns:wps="http://schemas.microsoft.com/office/word/2010/wordprocessingShape" mc:Ignorable="w14 w15 w16se w16cid w16 w16cex w16sdtdh w16sdtfl w16du wp14">
   <w15:commentEx w15:paraId="61F4C970" w15:done="0"/>
   <w15:commentEx w15:paraId="545FF6D7" w15:done="0"/>
 </w15:commentsEx>
 </file>
 
 <file path=word/commentsExtensible.xml><?xml version="1.0" encoding="utf-8"?>
-<w16cex:commentsExtensible xmlns:wpc="http://schemas.microsoft.com/office/word/2010/wordprocessingCanvas" xmlns:cx="http://schemas.microsoft.com/office/drawing/2014/chartex" xmlns:cx1="http://schemas.microsoft.com/office/drawing/2015/9/8/chartex" xmlns:cx2="http://schemas.microsoft.com/office/drawing/2015/10/21/chartex" xmlns:cx3="http://schemas.microsoft.com/office/drawing/2016/5/9/chartex" xmlns:cx4="http://schemas.microsoft.com/office/drawing/2016/5/10/chartex" xmlns:cx5="http://schemas.microsoft.com/office/drawing/2016/5/11/chartex" xmlns:cx6="http://schemas.microsoft.com/office/drawing/2016/5/12/chartex" xmlns:cx7="http://schemas.microsoft.com/office/drawing/2016/5/13/chartex" xmlns:cx8="http://schemas.microsoft.com/office/drawing/2016/5/14/chartex" xmlns:cr="http://schemas.microsoft.com/office/comments/2020/reactions" xmlns:mc="http://schemas.openxmlformats.org/markup-compatibility/2006" xmlns:aink="http://schemas.microsoft.com/office/drawing/2016/ink" xmlns:am3d="http://schemas.microsoft.com/office/drawing/2017/model3d" xmlns:o="urn:schemas-microsoft-com:office:office" xmlns:oel="http://schemas.microsoft.com/office/2019/extlst" xmlns:r="http://schemas.openxmlformats.org/officeDocument/2006/relationships" xmlns:m="http://schemas.openxmlformats.org/officeDocument/2006/math" xmlns:v="urn:schemas-microsoft-com:vml" xmlns:wp14="http://schemas.microsoft.com/office/word/2010/wordprocessingDrawing" xmlns:wp="http://schemas.openxmlformats.org/drawingml/2006/wordprocessingDrawing" xmlns:w10="urn:schemas-microsoft-com:office:word" xmlns:w="http://schemas.openxmlformats.org/wordprocessingml/2006/main" xmlns:w14="http://schemas.microsoft.com/office/word/2010/wordml" xmlns:w15="http://schemas.microsoft.com/office/word/2012/wordml" xmlns:w16cex="http://schemas.microsoft.com/office/word/2018/wordml/cex" xmlns:w16cid="http://schemas.microsoft.com/office/word/2016/wordml/cid" xmlns:w16="http://schemas.microsoft.com/office/word/2018/wordml" xmlns:w16du="http://schemas.microsoft.com/office/word/2023/wordml/word16du" xmlns:w16sdtdh="http://schemas.microsoft.com/office/word/2020/wordml/sdtdatahash" xmlns:w16sdtfl="http://schemas.microsoft.com/office/word/2024/wordml/sdtformatlock" xmlns:w16se="http://schemas.microsoft.com/office/word/2015/wordml/symex" xmlns:wpg="http://schemas.microsoft.com/office/word/2010/wordprocessingGroup" xmlns:wpi="http://schemas.microsoft.com/office/word/2010/wordprocessingInk" xmlns:wne="http://schemas.microsoft.com/office/word/2006/wordml" xmlns:wps="http://schemas.microsoft.com/office/word/2010/wordprocessingShape" mc:Ignorable="w14 w15 w16se w16cid w16 w16cex w16sdtdh w16sdtfl cr w16du wp14">
+<w16cex:commentsExtensible xmlns:wpc="http://schemas.microsoft.com/office/word/2010/wordprocessingCanvas" xmlns:cx="http://schemas.microsoft.com/office/drawing/2014/chartex" xmlns:cx1="http://schemas.microsoft.com/office/drawing/2015/9/8/chartex" xmlns:cx2="http://schemas.microsoft.com/office/drawing/2015/10/21/chartex" xmlns:cx3="http://schemas.microsoft.com/office/drawing/2016/5/9/chartex" xmlns:cx4="http://schemas.microsoft.com/office/drawing/2016/5/10/chartex" xmlns:cx5="http://schemas.microsoft.com/office/drawing/2016/5/11/chartex" xmlns:cx6="http://schemas.microsoft.com/office/drawing/2016/5/12/chartex" xmlns:cx7="http://schemas.microsoft.com/office/drawing/2016/5/13/chartex" xmlns:cx8="http://schemas.microsoft.com/office/drawing/2016/5/14/chartex" xmlns:cr="http://schemas.microsoft.com/office/comments/2020/reactions" xmlns:mc="http://schemas.openxmlformats.org/markup-compatibility/2006" xmlns:aink="http://schemas.microsoft.com/office/drawing/2016/ink" xmlns:am3d="http://schemas.microsoft.com/office/drawing/2017/model3d" xmlns:o="urn:schemas-microsoft-com:office:office" xmlns:oel="http://schemas.microsoft.com/office/2019/extlst" xmlns:r="http://schemas.openxmlformats.org/officeDocument/2006/relationships" xmlns:m="http://schemas.openxmlformats.org/officeDocument/2006/math" xmlns:v="urn:schemas-microsoft-com:vml" xmlns:wp14="http://schemas.microsoft.com/office/word/2010/wordprocessingDrawing" xmlns:wp="http://schemas.openxmlformats.org/drawingml/2006/wordprocessingDrawing" xmlns:w10="urn:schemas-microsoft-com:office:word" xmlns:w="http://schemas.openxmlformats.org/wordprocessingml/2006/main" xmlns:w14="http://schemas.microsoft.com/office/word/2010/wordml" xmlns:w15="http://schemas.microsoft.com/office/word/2012/wordml" xmlns:w16cei="http://schemas.microsoft.com/office/word/2026/wordml/cei" xmlns:w16cex="http://schemas.microsoft.com/office/word/2018/wordml/cex" xmlns:w16cid="http://schemas.microsoft.com/office/word/2016/wordml/cid" xmlns:w16="http://schemas.microsoft.com/office/word/2018/wordml" xmlns:w16du="http://schemas.microsoft.com/office/word/2023/wordml/word16du" xmlns:w16sdtdh="http://schemas.microsoft.com/office/word/2020/wordml/sdtdatahash" xmlns:w16sdtfl="http://schemas.microsoft.com/office/word/2024/wordml/sdtformatlock" xmlns:w16se="http://schemas.microsoft.com/office/word/2015/wordml/symex" xmlns:wpg="http://schemas.microsoft.com/office/word/2010/wordprocessingGroup" xmlns:wpi="http://schemas.microsoft.com/office/word/2010/wordprocessingInk" xmlns:wne="http://schemas.microsoft.com/office/word/2006/wordml" xmlns:wps="http://schemas.microsoft.com/office/word/2010/wordprocessingShape" mc:Ignorable="w14 w15 w16se w16cid w16 w16cex w16sdtdh w16sdtfl cr w16du wp14">
   <w16cex:commentExtensible w16cex:durableId="3239614E" w16cex:dateUtc="2026-06-29T22:27:00Z"/>
   <w16cex:commentExtensible w16cex:durableId="738A3A78" w16cex:dateUtc="2026-06-29T21:56:00Z"/>
 </w16cex:commentsExtensible>
 </file>
 
 <file path=word/commentsIds.xml><?xml version="1.0" encoding="utf-8"?>
-<w16cid:commentsIds xmlns:wpc="http://schemas.microsoft.com/office/word/2010/wordprocessingCanvas" xmlns:cx="http://schemas.microsoft.com/office/drawing/2014/chartex" xmlns:cx1="http://schemas.microsoft.com/office/drawing/2015/9/8/chartex" xmlns:cx2="http://schemas.microsoft.com/office/drawing/2015/10/21/chartex" xmlns:cx3="http://schemas.microsoft.com/office/drawing/2016/5/9/chartex" xmlns:cx4="http://schemas.microsoft.com/office/drawing/2016/5/10/chartex" xmlns:cx5="http://schemas.microsoft.com/office/drawing/2016/5/11/chartex" xmlns:cx6="http://schemas.microsoft.com/office/drawing/2016/5/12/chartex" xmlns:cx7="http://schemas.microsoft.com/office/drawing/2016/5/13/chartex" xmlns:cx8="http://schemas.microsoft.com/office/drawing/2016/5/14/chartex" xmlns:mc="http://schemas.openxmlformats.org/markup-compatibility/2006" xmlns:aink="http://schemas.microsoft.com/office/drawing/2016/ink" xmlns:am3d="http://schemas.microsoft.com/office/drawing/2017/model3d" xmlns:o="urn:schemas-microsoft-com:office:office" xmlns:oel="http://schemas.microsoft.com/office/2019/extlst" xmlns:r="http://schemas.openxmlformats.org/officeDocument/2006/relationships" xmlns:m="http://schemas.openxmlformats.org/officeDocument/2006/math" xmlns:v="urn:schemas-microsoft-com:vml" xmlns:wp14="http://schemas.microsoft.com/office/word/2010/wordprocessingDrawing" xmlns:wp="http://schemas.openxmlformats.org/drawingml/2006/wordprocessingDrawing" xmlns:w10="urn:schemas-microsoft-com:office:word" xmlns:w="http://schemas.openxmlformats.org/wordprocessingml/2006/main" xmlns:w14="http://schemas.microsoft.com/office/word/2010/wordml" xmlns:w15="http://schemas.microsoft.com/office/word/2012/wordml" xmlns:w16cex="http://schemas.microsoft.com/office/word/2018/wordml/cex" xmlns:w16cid="http://schemas.microsoft.com/office/word/2016/wordml/cid" xmlns:w16="http://schemas.microsoft.com/office/word/2018/wordml" xmlns:w16du="http://schemas.microsoft.com/office/word/2023/wordml/word16du" xmlns:w16sdtdh="http://schemas.microsoft.com/office/word/2020/wordml/sdtdatahash" xmlns:w16sdtfl="http://schemas.microsoft.com/office/word/2024/wordml/sdtformatlock" xmlns:w16se="http://schemas.microsoft.com/office/word/2015/wordml/symex" xmlns:wpg="http://schemas.microsoft.com/office/word/2010/wordprocessingGroup" xmlns:wpi="http://schemas.microsoft.com/office/word/2010/wordprocessingInk" xmlns:wne="http://schemas.microsoft.com/office/word/2006/wordml" xmlns:wps="http://schemas.microsoft.com/office/word/2010/wordprocessingShape" mc:Ignorable="w14 w15 w16se w16cid w16 w16cex w16sdtdh w16sdtfl w16du wp14">
+<w16cid:commentsIds xmlns:wpc="http://schemas.microsoft.com/office/word/2010/wordprocessingCanvas" xmlns:cx="http://schemas.microsoft.com/office/drawing/2014/chartex" xmlns:cx1="http://schemas.microsoft.com/office/drawing/2015/9/8/chartex" xmlns:cx2="http://schemas.microsoft.com/office/drawing/2015/10/21/chartex" xmlns:cx3="http://schemas.microsoft.com/office/drawing/2016/5/9/chartex" xmlns:cx4="http://schemas.microsoft.com/office/drawing/2016/5/10/chartex" xmlns:cx5="http://schemas.microsoft.com/office/drawing/2016/5/11/chartex" xmlns:cx6="http://schemas.microsoft.com/office/drawing/2016/5/12/chartex" xmlns:cx7="http://schemas.microsoft.com/office/drawing/2016/5/13/chartex" xmlns:cx8="http://schemas.microsoft.com/office/drawing/2016/5/14/chartex" xmlns:mc="http://schemas.openxmlformats.org/markup-compatibility/2006" xmlns:aink="http://schemas.microsoft.com/office/drawing/2016/ink" xmlns:am3d="http://schemas.microsoft.com/office/drawing/2017/model3d" xmlns:o="urn:schemas-microsoft-com:office:office" xmlns:oel="http://schemas.microsoft.com/office/2019/extlst" xmlns:r="http://schemas.openxmlformats.org/officeDocument/2006/relationships" xmlns:m="http://schemas.openxmlformats.org/officeDocument/2006/math" xmlns:v="urn:schemas-microsoft-com:vml" xmlns:wp14="http://schemas.microsoft.com/office/word/2010/wordprocessingDrawing" xmlns:wp="http://schemas.openxmlformats.org/drawingml/2006/wordprocessingDrawing" xmlns:w10="urn:schemas-microsoft-com:office:word" xmlns:w="http://schemas.openxmlformats.org/wordprocessingml/2006/main" xmlns:w14="http://schemas.microsoft.com/office/word/2010/wordml" xmlns:w15="http://schemas.microsoft.com/office/word/2012/wordml" xmlns:w16cei="http://schemas.microsoft.com/office/word/2026/wordml/cei" xmlns:w16cex="http://schemas.microsoft.com/office/word/2018/wordml/cex" xmlns:w16cid="http://schemas.microsoft.com/office/word/2016/wordml/cid" xmlns:w16="http://schemas.microsoft.com/office/word/2018/wordml" xmlns:w16du="http://schemas.microsoft.com/office/word/2023/wordml/word16du" xmlns:w16sdtdh="http://schemas.microsoft.com/office/word/2020/wordml/sdtdatahash" xmlns:w16sdtfl="http://schemas.microsoft.com/office/word/2024/wordml/sdtformatlock" xmlns:w16se="http://schemas.microsoft.com/office/word/2015/wordml/symex" xmlns:wpg="http://schemas.microsoft.com/office/word/2010/wordprocessingGroup" xmlns:wpi="http://schemas.microsoft.com/office/word/2010/wordprocessingInk" xmlns:wne="http://schemas.microsoft.com/office/word/2006/wordml" xmlns:wps="http://schemas.microsoft.com/office/word/2010/wordprocessingShape" mc:Ignorable="w14 w15 w16se w16cid w16 w16cex w16sdtdh w16sdtfl w16du wp14">
   <w16cid:commentId w16cid:paraId="61F4C970" w16cid:durableId="3239614E"/>
   <w16cid:commentId w16cid:paraId="545FF6D7" w16cid:durableId="738A3A78"/>
 </w16cid:commentsIds>
 </file>
 
 <file path=word/numbering.xml><?xml version="1.0" encoding="utf-8"?>
-<w:numbering xmlns:wpc="http://schemas.microsoft.com/office/word/2010/wordprocessingCanvas" xmlns:cx="http://schemas.microsoft.com/office/drawing/2014/chartex" xmlns:cx1="http://schemas.microsoft.com/office/drawing/2015/9/8/chartex" xmlns:cx2="http://schemas.microsoft.com/office/drawing/2015/10/21/chartex" xmlns:cx3="http://schemas.microsoft.com/office/drawing/2016/5/9/chartex" xmlns:cx4="http://schemas.microsoft.com/office/drawing/2016/5/10/chartex" xmlns:cx5="http://schemas.microsoft.com/office/drawing/2016/5/11/chartex" xmlns:cx6="http://schemas.microsoft.com/office/drawing/2016/5/12/chartex" xmlns:cx7="http://schemas.microsoft.com/office/drawing/2016/5/13/chartex" xmlns:cx8="http://schemas.microsoft.com/office/drawing/2016/5/14/chartex" xmlns:mc="http://schemas.openxmlformats.org/markup-compatibility/2006" xmlns:aink="http://schemas.microsoft.com/office/drawing/2016/ink" xmlns:am3d="http://schemas.microsoft.com/office/drawing/2017/model3d" xmlns:o="urn:schemas-microsoft-com:office:office" xmlns:oel="http://schemas.microsoft.com/office/2019/extlst" xmlns:r="http://schemas.openxmlformats.org/officeDocument/2006/relationships" xmlns:m="http://schemas.openxmlformats.org/officeDocument/2006/math" xmlns:v="urn:schemas-microsoft-com:vml" xmlns:wp14="http://schemas.microsoft.com/office/word/2010/wordprocessingDrawing" xmlns:wp="http://schemas.openxmlformats.org/drawingml/2006/wordprocessingDrawing" xmlns:w10="urn:schemas-microsoft-com:office:word" xmlns:w="http://schemas.openxmlformats.org/wordprocessingml/2006/main" xmlns:w14="http://schemas.microsoft.com/office/word/2010/wordml" xmlns:w15="http://schemas.microsoft.com/office/word/2012/wordml" xmlns:w16cex="http://schemas.microsoft.com/office/word/2018/wordml/cex" xmlns:w16cid="http://schemas.microsoft.com/office/word/2016/wordml/cid" xmlns:w16="http://schemas.microsoft.com/office/word/2018/wordml" xmlns:w16du="http://schemas.microsoft.com/office/word/2023/wordml/word16du" xmlns:w16sdtdh="http://schemas.microsoft.com/office/word/2020/wordml/sdtdatahash" xmlns:w16sdtfl="http://schemas.microsoft.com/office/word/2024/wordml/sdtformatlock" xmlns:w16se="http://schemas.microsoft.com/office/word/2015/wordml/symex" xmlns:wpg="http://schemas.microsoft.com/office/word/2010/wordprocessingGroup" xmlns:wpi="http://schemas.microsoft.com/office/word/2010/wordprocessingInk" xmlns:wne="http://schemas.microsoft.com/office/word/2006/wordml" xmlns:wps="http://schemas.microsoft.com/office/word/2010/wordprocessingShape" mc:Ignorable="w14 w15 w16se w16cid w16 w16cex w16sdtdh w16sdtfl w16du wp14">
+<w:numbering xmlns:wpc="http://schemas.microsoft.com/office/word/2010/wordprocessingCanvas" xmlns:cx="http://schemas.microsoft.com/office/drawing/2014/chartex" xmlns:cx1="http://schemas.microsoft.com/office/drawing/2015/9/8/chartex" xmlns:cx2="http://schemas.microsoft.com/office/drawing/2015/10/21/chartex" xmlns:cx3="http://schemas.microsoft.com/office/drawing/2016/5/9/chartex" xmlns:cx4="http://schemas.microsoft.com/office/drawing/2016/5/10/chartex" xmlns:cx5="http://schemas.microsoft.com/office/drawing/2016/5/11/chartex" xmlns:cx6="http://schemas.microsoft.com/office/drawing/2016/5/12/chartex" xmlns:cx7="http://schemas.microsoft.com/office/drawing/2016/5/13/chartex" xmlns:cx8="http://schemas.microsoft.com/office/drawing/2016/5/14/chartex" xmlns:mc="http://schemas.openxmlformats.org/markup-compatibility/2006" xmlns:aink="http://schemas.microsoft.com/office/drawing/2016/ink" xmlns:am3d="http://schemas.microsoft.com/office/drawing/2017/model3d" xmlns:o="urn:schemas-microsoft-com:office:office" xmlns:oel="http://schemas.microsoft.com/office/2019/extlst" xmlns:r="http://schemas.openxmlformats.org/officeDocument/2006/relationships" xmlns:m="http://schemas.openxmlformats.org/officeDocument/2006/math" xmlns:v="urn:schemas-microsoft-com:vml" xmlns:wp14="http://schemas.microsoft.com/office/word/2010/wordprocessingDrawing" xmlns:wp="http://schemas.openxmlformats.org/drawingml/2006/wordprocessingDrawing" xmlns:w10="urn:schemas-microsoft-com:office:word" xmlns:w="http://schemas.openxmlformats.org/wordprocessingml/2006/main" xmlns:w14="http://schemas.microsoft.com/office/word/2010/wordml" xmlns:w15="http://schemas.microsoft.com/office/word/2012/wordml" xmlns:w16cei="http://schemas.microsoft.com/office/word/2026/wordml/cei" xmlns:w16cex="http://schemas.microsoft.com/office/word/2018/wordml/cex" xmlns:w16cid="http://schemas.microsoft.com/office/word/2016/wordml/cid" xmlns:w16="http://schemas.microsoft.com/office/word/2018/wordml" xmlns:w16du="http://schemas.microsoft.com/office/word/2023/wordml/word16du" xmlns:w16sdtdh="http://schemas.microsoft.com/office/word/2020/wordml/sdtdatahash" xmlns:w16sdtfl="http://schemas.microsoft.com/office/word/2024/wordml/sdtformatlock" xmlns:w16se="http://schemas.microsoft.com/office/word/2015/wordml/symex" xmlns:wpg="http://schemas.microsoft.com/office/word/2010/wordprocessingGroup" xmlns:wpi="http://schemas.microsoft.com/office/word/2010/wordprocessingInk" xmlns:wne="http://schemas.microsoft.com/office/word/2006/wordml" xmlns:wps="http://schemas.microsoft.com/office/word/2010/wordprocessingShape" mc:Ignorable="w14 w15 w16se w16cid w16 w16cex w16sdtdh w16sdtfl w16du wp14">
   <w:abstractNum w:abstractNumId="0" w15:restartNumberingAfterBreak="0">
     <w:nsid w:val="0B835FFE"/>
     <w:multiLevelType w:val="hybridMultilevel"/>
@@ -8997,7 +8763,7 @@
 </file>
 
 <file path=word/people.xml><?xml version="1.0" encoding="utf-8"?>
-<w15:people xmlns:wpc="http://schemas.microsoft.com/office/word/2010/wordprocessingCanvas" xmlns:cx="http://schemas.microsoft.com/office/drawing/2014/chartex" xmlns:cx1="http://schemas.microsoft.com/office/drawing/2015/9/8/chartex" xmlns:cx2="http://schemas.microsoft.com/office/drawing/2015/10/21/chartex" xmlns:cx3="http://schemas.microsoft.com/office/drawing/2016/5/9/chartex" xmlns:cx4="http://schemas.microsoft.com/office/drawing/2016/5/10/chartex" xmlns:cx5="http://schemas.microsoft.com/office/drawing/2016/5/11/chartex" xmlns:cx6="http://schemas.microsoft.com/office/drawing/2016/5/12/chartex" xmlns:cx7="http://schemas.microsoft.com/office/drawing/2016/5/13/chartex" xmlns:cx8="http://schemas.microsoft.com/office/drawing/2016/5/14/chartex" xmlns:mc="http://schemas.openxmlformats.org/markup-compatibility/2006" xmlns:aink="http://schemas.microsoft.com/office/drawing/2016/ink" xmlns:am3d="http://schemas.microsoft.com/office/drawing/2017/model3d" xmlns:o="urn:schemas-microsoft-com:office:office" xmlns:oel="http://schemas.microsoft.com/office/2019/extlst" xmlns:r="http://schemas.openxmlformats.org/officeDocument/2006/relationships" xmlns:m="http://schemas.openxmlformats.org/officeDocument/2006/math" xmlns:v="urn:schemas-microsoft-com:vml" xmlns:wp14="http://schemas.microsoft.com/office/word/2010/wordprocessingDrawing" xmlns:wp="http://schemas.openxmlformats.org/drawingml/2006/wordprocessingDrawing" xmlns:w10="urn:schemas-microsoft-com:office:word" xmlns:w="http://schemas.openxmlformats.org/wordprocessingml/2006/main" xmlns:w14="http://schemas.microsoft.com/office/word/2010/wordml" xmlns:w15="http://schemas.microsoft.com/office/word/2012/wordml" xmlns:w16cex="http://schemas.microsoft.com/office/word/2018/wordml/cex" xmlns:w16cid="http://schemas.microsoft.com/office/word/2016/wordml/cid" xmlns:w16="http://schemas.microsoft.com/office/word/2018/wordml" xmlns:w16du="http://schemas.microsoft.com/office/word/2023/wordml/word16du" xmlns:w16sdtdh="http://schemas.microsoft.com/office/word/2020/wordml/sdtdatahash" xmlns:w16sdtfl="http://schemas.microsoft.com/office/word/2024/wordml/sdtformatlock" xmlns:w16se="http://schemas.microsoft.com/office/word/2015/wordml/symex" xmlns:wpg="http://schemas.microsoft.com/office/word/2010/wordprocessingGroup" xmlns:wpi="http://schemas.microsoft.com/office/word/2010/wordprocessingInk" xmlns:wne="http://schemas.microsoft.com/office/word/2006/wordml" xmlns:wps="http://schemas.microsoft.com/office/word/2010/wordprocessingShape" mc:Ignorable="w14 w15 w16se w16cid w16 w16cex w16sdtdh w16sdtfl w16du wp14">
+<w15:people xmlns:wpc="http://schemas.microsoft.com/office/word/2010/wordprocessingCanvas" xmlns:cx="http://schemas.microsoft.com/office/drawing/2014/chartex" xmlns:cx1="http://schemas.microsoft.com/office/drawing/2015/9/8/chartex" xmlns:cx2="http://schemas.microsoft.com/office/drawing/2015/10/21/chartex" xmlns:cx3="http://schemas.microsoft.com/office/drawing/2016/5/9/chartex" xmlns:cx4="http://schemas.microsoft.com/office/drawing/2016/5/10/chartex" xmlns:cx5="http://schemas.microsoft.com/office/drawing/2016/5/11/chartex" xmlns:cx6="http://schemas.microsoft.com/office/drawing/2016/5/12/chartex" xmlns:cx7="http://schemas.microsoft.com/office/drawing/2016/5/13/chartex" xmlns:cx8="http://schemas.microsoft.com/office/drawing/2016/5/14/chartex" xmlns:mc="http://schemas.openxmlformats.org/markup-compatibility/2006" xmlns:aink="http://schemas.microsoft.com/office/drawing/2016/ink" xmlns:am3d="http://schemas.microsoft.com/office/drawing/2017/model3d" xmlns:o="urn:schemas-microsoft-com:office:office" xmlns:oel="http://schemas.microsoft.com/office/2019/extlst" xmlns:r="http://schemas.openxmlformats.org/officeDocument/2006/relationships" xmlns:m="http://schemas.openxmlformats.org/officeDocument/2006/math" xmlns:v="urn:schemas-microsoft-com:vml" xmlns:wp14="http://schemas.microsoft.com/office/word/2010/wordprocessingDrawing" xmlns:wp="http://schemas.openxmlformats.org/drawingml/2006/wordprocessingDrawing" xmlns:w10="urn:schemas-microsoft-com:office:word" xmlns:w="http://schemas.openxmlformats.org/wordprocessingml/2006/main" xmlns:w14="http://schemas.microsoft.com/office/word/2010/wordml" xmlns:w15="http://schemas.microsoft.com/office/word/2012/wordml" xmlns:w16cei="http://schemas.microsoft.com/office/word/2026/wordml/cei" xmlns:w16cex="http://schemas.microsoft.com/office/word/2018/wordml/cex" xmlns:w16cid="http://schemas.microsoft.com/office/word/2016/wordml/cid" xmlns:w16="http://schemas.microsoft.com/office/word/2018/wordml" xmlns:w16du="http://schemas.microsoft.com/office/word/2023/wordml/word16du" xmlns:w16sdtdh="http://schemas.microsoft.com/office/word/2020/wordml/sdtdatahash" xmlns:w16sdtfl="http://schemas.microsoft.com/office/word/2024/wordml/sdtformatlock" xmlns:w16se="http://schemas.microsoft.com/office/word/2015/wordml/symex" xmlns:wpg="http://schemas.microsoft.com/office/word/2010/wordprocessingGroup" xmlns:wpi="http://schemas.microsoft.com/office/word/2010/wordprocessingInk" xmlns:wne="http://schemas.microsoft.com/office/word/2006/wordml" xmlns:wps="http://schemas.microsoft.com/office/word/2010/wordprocessingShape" mc:Ignorable="w14 w15 w16se w16cid w16 w16cex w16sdtdh w16sdtfl w16du wp14">
   <w15:person w15:author="Johnson, Nykesha R.">
     <w15:presenceInfo w15:providerId="AD" w15:userId="S::nykeshajohnson@hsph.harvard.edu::d88bc874-d781-410a-8c92-01416464355b"/>
   </w15:person>
@@ -9607,6 +9373,7 @@
   <w:style w:type="character" w:default="1" w:styleId="DefaultParagraphFont">
     <w:name w:val="Default Paragraph Font"/>
     <w:uiPriority w:val="1"/>
+    <w:semiHidden/>
     <w:unhideWhenUsed/>
   </w:style>
   <w:style w:type="table" w:default="1" w:styleId="TableNormal">
@@ -10091,6 +9858,16 @@
       <w14:ligatures w14:val="none"/>
     </w:rPr>
   </w:style>
+  <w:style w:type="paragraph" w:styleId="Revision">
+    <w:name w:val="Revision"/>
+    <w:hidden/>
+    <w:uiPriority w:val="99"/>
+    <w:semiHidden/>
+    <w:rsid w:val="006B159F"/>
+    <w:pPr>
+      <w:spacing w:after="0" w:line="240" w:lineRule="auto"/>
+    </w:pPr>
+  </w:style>
 </w:styles>
 </file>
 

</xml_diff>